<commit_message>
Separation cours prives / collectifs et total hebdomadaire
Chaque document distingue desormais les cours collectifs des cours
prives (classes d'apres le libelle du cours dans iClub), avec le
sous-total de chaque categorie et le total par semaine.

Les heures totales sont calculees sur les plages fusionnees : quand un
prof encadre plusieurs cours en meme temps (ex. 4 terrains de League
Cup le samedi), l'heure n'est comptee qu'une fois.

Co-Authored-By: Claude Opus 5 <noreply@anthropic.com>
Claude-Session: https://claude.ai/code/session_01CP9eZ8ypAHjVkDVd1FLqef
</commit_message>
<xml_diff>
--- a/Horaires profs 2026-2027/Horaire - Adel Taieb.docx
+++ b/Horaires profs 2026-2027/Horaire - Adel Taieb.docx
@@ -22,7 +22,7 @@
         <w:pBdr>
           <w:bottom w:val="single" w:color="1F3864" w:sz="6" w:space="8"/>
         </w:pBdr>
-        <w:spacing w:after="400"/>
+        <w:spacing w:after="120"/>
       </w:pPr>
       <w:r>
         <w:rPr>
@@ -31,6 +31,34 @@
           <w:szCs w:val="22"/>
         </w:rPr>
         <w:t xml:space="preserve">Horaires — Cycle annuel 2026-2027</w:t>
+      </w:r>
+    </w:p>
+    <w:p>
+      <w:pPr>
+        <w:tabs>
+          <w:tab w:val="right" w:pos="9026"/>
+        </w:tabs>
+        <w:spacing w:after="140" w:before="320"/>
+      </w:pPr>
+      <w:r>
+        <w:rPr>
+          <w:b/>
+          <w:bCs/>
+          <w:color w:val="1F3864"/>
+          <w:sz w:val="26"/>
+          <w:szCs w:val="26"/>
+        </w:rPr>
+        <w:t xml:space="preserve">Cours collectifs</w:t>
+      </w:r>
+      <w:r>
+        <w:rPr>
+          <w:b/>
+          <w:bCs/>
+          <w:color w:val="595959"/>
+          <w:sz w:val="24"/>
+          <w:szCs w:val="24"/>
+        </w:rPr>
+        <w:t xml:space="preserve">	3h30</w:t>
       </w:r>
     </w:p>
     <w:tbl>
@@ -61,9 +89,9 @@
             </w:tcBorders>
             <w:shd w:fill="F2F5FA" w:color="auto" w:val="clear"/>
             <w:tcMar>
-              <w:top w:type="dxa" w:w="120"/>
+              <w:top w:type="dxa" w:w="110"/>
               <w:left w:type="dxa" w:w="140"/>
-              <w:bottom w:type="dxa" w:w="120"/>
+              <w:bottom w:type="dxa" w:w="110"/>
               <w:right w:type="dxa" w:w="140"/>
             </w:tcMar>
           </w:tcPr>
@@ -91,9 +119,9 @@
             </w:tcBorders>
             <w:shd w:fill="F2F5FA" w:color="auto" w:val="clear"/>
             <w:tcMar>
-              <w:top w:type="dxa" w:w="120"/>
+              <w:top w:type="dxa" w:w="110"/>
               <w:left w:type="dxa" w:w="140"/>
-              <w:bottom w:type="dxa" w:w="120"/>
+              <w:bottom w:type="dxa" w:w="110"/>
               <w:right w:type="dxa" w:w="140"/>
             </w:tcMar>
           </w:tcPr>
@@ -109,6 +137,80 @@
         </w:tc>
       </w:tr>
     </w:tbl>
+    <w:p>
+      <w:pPr>
+        <w:tabs>
+          <w:tab w:val="right" w:pos="9026"/>
+        </w:tabs>
+        <w:spacing w:after="140" w:before="320"/>
+      </w:pPr>
+      <w:r>
+        <w:rPr>
+          <w:b/>
+          <w:bCs/>
+          <w:color w:val="1F3864"/>
+          <w:sz w:val="26"/>
+          <w:szCs w:val="26"/>
+        </w:rPr>
+        <w:t xml:space="preserve">Cours privés</w:t>
+      </w:r>
+      <w:r>
+        <w:rPr>
+          <w:b/>
+          <w:bCs/>
+          <w:color w:val="595959"/>
+          <w:sz w:val="24"/>
+          <w:szCs w:val="24"/>
+        </w:rPr>
+        <w:t xml:space="preserve">	0h</w:t>
+      </w:r>
+    </w:p>
+    <w:p>
+      <w:pPr>
+        <w:spacing w:after="60"/>
+      </w:pPr>
+      <w:r>
+        <w:rPr>
+          <w:i/>
+          <w:iCs/>
+          <w:color w:val="595959"/>
+          <w:sz w:val="22"/>
+          <w:szCs w:val="22"/>
+        </w:rPr>
+        <w:t xml:space="preserve">Aucun</w:t>
+      </w:r>
+    </w:p>
+    <w:p>
+      <w:pPr>
+        <w:pBdr>
+          <w:top w:val="single" w:color="1F3864" w:sz="6" w:space="10"/>
+        </w:pBdr>
+        <w:tabs>
+          <w:tab w:val="right" w:pos="9026"/>
+        </w:tabs>
+        <w:spacing w:before="420"/>
+      </w:pPr>
+      <w:r>
+        <w:rPr>
+          <w:b/>
+          <w:bCs/>
+          <w:color w:val="1F3864"/>
+          <w:sz w:val="26"/>
+          <w:szCs w:val="26"/>
+        </w:rPr>
+        <w:t xml:space="preserve">Total par semaine</w:t>
+      </w:r>
+      <w:r>
+        <w:rPr>
+          <w:b/>
+          <w:bCs/>
+          <w:color w:val="1F3864"/>
+          <w:sz w:val="30"/>
+          <w:szCs w:val="30"/>
+        </w:rPr>
+        <w:t xml:space="preserve">	3h30</w:t>
+      </w:r>
+    </w:p>
     <w:sectPr>
       <w:pgSz w:w="11906" w:h="16838" w:orient="portrait"/>
       <w:pgMar w:top="1134" w:right="1134" w:bottom="1134" w:left="1134" w:header="708" w:footer="708" w:gutter="0"/>

</xml_diff>

<commit_message>
Mise a jour apres correction du planning samedi
Reextraction complete depuis iClub. Changements :
- Xavier Bureille ajoute (2h), Felipe Andres Quesney Andrade retire
- Samedi retravaille pour Julien Chibli, Celia Houmid Bennani,
  Adel Taieb, Elias Taieb et Taha Yassine
- Les deux chevauchements partiels (Mourad Houmid Bennani, Adel Taieb)
  ont disparu ; ne restent que des groupes reellement simultanes,
  comptes une seule fois dans le total

Co-Authored-By: Claude Opus 5 <noreply@anthropic.com>
Claude-Session: https://claude.ai/code/session_01CP9eZ8ypAHjVkDVd1FLqef
</commit_message>
<xml_diff>
--- a/Horaires profs 2026-2027/Horaire - Adel Taieb.docx
+++ b/Horaires profs 2026-2027/Horaire - Adel Taieb.docx
@@ -58,7 +58,7 @@
           <w:sz w:val="24"/>
           <w:szCs w:val="24"/>
         </w:rPr>
-        <w:t xml:space="preserve">	3h30</w:t>
+        <w:t xml:space="preserve">	5h</w:t>
       </w:r>
     </w:p>
     <w:tbl>
@@ -131,7 +131,7 @@
                 <w:sz w:val="22"/>
                 <w:szCs w:val="22"/>
               </w:rPr>
-              <w:t xml:space="preserve">de 9h à 11h, de 12h30 à 14h</w:t>
+              <w:t xml:space="preserve">de 9h à 14h</w:t>
             </w:r>
           </w:p>
         </w:tc>
@@ -208,7 +208,7 @@
           <w:sz w:val="30"/>
           <w:szCs w:val="30"/>
         </w:rPr>
-        <w:t xml:space="preserve">	3h30</w:t>
+        <w:t xml:space="preserve">	5h</w:t>
       </w:r>
     </w:p>
     <w:sectPr>

</xml_diff>

<commit_message>
Total journalier dans le recapitulatif, applique aux 22 documents
Chaque ligne du tableau recapitulatif affiche desormais le nombre
d'heures du jour, aligne a droite de la cellule ("= 6h30").

Le format a trois tableaux (recapitulatif, collectifs, prives) est
generalise a l'ensemble des professeurs.

Verifie : pour chaque prof, la somme des totaux journaliers correspond
au total hebdomadaire.

Co-Authored-By: Claude Opus 5 <noreply@anthropic.com>
Claude-Session: https://claude.ai/code/session_01CP9eZ8ypAHjVkDVd1FLqef
</commit_message>
<xml_diff>
--- a/Horaires profs 2026-2027/Horaire - Adel Taieb.docx
+++ b/Horaires profs 2026-2027/Horaire - Adel Taieb.docx
@@ -48,17 +48,7 @@
           <w:sz w:val="26"/>
           <w:szCs w:val="26"/>
         </w:rPr>
-        <w:t xml:space="preserve">Cours collectifs</w:t>
-      </w:r>
-      <w:r>
-        <w:rPr>
-          <w:b/>
-          <w:bCs/>
-          <w:color w:val="595959"/>
-          <w:sz w:val="24"/>
-          <w:szCs w:val="24"/>
-        </w:rPr>
-        <w:t xml:space="preserve">	5h</w:t>
+        <w:t xml:space="preserve">Récapitulatif par jour</w:t>
       </w:r>
     </w:p>
     <w:tbl>
@@ -74,13 +64,13 @@
         </w:tblBorders>
       </w:tblPr>
       <w:tblGrid>
-        <w:gridCol w:w="2400"/>
-        <w:gridCol w:w="6626"/>
+        <w:gridCol w:w="2000"/>
+        <w:gridCol w:w="7026"/>
       </w:tblGrid>
       <w:tr>
         <w:tc>
           <w:tcPr>
-            <w:tcW w:type="dxa" w:w="2400"/>
+            <w:tcW w:type="dxa" w:w="2000"/>
             <w:tcBorders>
               <w:top w:val="none" w:color="FFFFFF" w:sz="0"/>
               <w:left w:val="none" w:color="FFFFFF" w:sz="0"/>
@@ -110,7 +100,126 @@
         </w:tc>
         <w:tc>
           <w:tcPr>
-            <w:tcW w:type="dxa" w:w="6626"/>
+            <w:tcW w:type="dxa" w:w="7026"/>
+            <w:tcBorders>
+              <w:top w:val="none" w:color="FFFFFF" w:sz="0"/>
+              <w:left w:val="none" w:color="FFFFFF" w:sz="0"/>
+              <w:bottom w:val="single" w:color="BFBFBF" w:sz="4"/>
+              <w:right w:val="none" w:color="FFFFFF" w:sz="0"/>
+            </w:tcBorders>
+            <w:shd w:fill="F2F5FA" w:color="auto" w:val="clear"/>
+            <w:tcMar>
+              <w:top w:type="dxa" w:w="110"/>
+              <w:left w:type="dxa" w:w="140"/>
+              <w:bottom w:type="dxa" w:w="110"/>
+              <w:right w:type="dxa" w:w="140"/>
+            </w:tcMar>
+          </w:tcPr>
+          <w:p>
+            <w:pPr>
+              <w:tabs>
+                <w:tab w:val="right" w:pos="6746"/>
+              </w:tabs>
+            </w:pPr>
+            <w:r>
+              <w:rPr>
+                <w:sz w:val="22"/>
+                <w:szCs w:val="22"/>
+              </w:rPr>
+              <w:t xml:space="preserve">de 9h à 14h</w:t>
+            </w:r>
+            <w:r>
+              <w:rPr>
+                <w:b/>
+                <w:bCs/>
+                <w:color w:val="1F3864"/>
+                <w:sz w:val="22"/>
+                <w:szCs w:val="22"/>
+              </w:rPr>
+              <w:t xml:space="preserve">	= 5h</w:t>
+            </w:r>
+          </w:p>
+        </w:tc>
+      </w:tr>
+    </w:tbl>
+    <w:p>
+      <w:pPr>
+        <w:tabs>
+          <w:tab w:val="right" w:pos="9026"/>
+        </w:tabs>
+        <w:spacing w:after="140" w:before="320"/>
+      </w:pPr>
+      <w:r>
+        <w:rPr>
+          <w:b/>
+          <w:bCs/>
+          <w:color w:val="1F3864"/>
+          <w:sz w:val="26"/>
+          <w:szCs w:val="26"/>
+        </w:rPr>
+        <w:t xml:space="preserve">Cours collectifs</w:t>
+      </w:r>
+      <w:r>
+        <w:rPr>
+          <w:b/>
+          <w:bCs/>
+          <w:color w:val="595959"/>
+          <w:sz w:val="24"/>
+          <w:szCs w:val="24"/>
+        </w:rPr>
+        <w:t xml:space="preserve">	5h</w:t>
+      </w:r>
+    </w:p>
+    <w:tbl>
+      <w:tblPr>
+        <w:tblW w:type="dxa" w:w="9026"/>
+        <w:tblBorders>
+          <w:top w:val="single" w:color="auto" w:sz="4"/>
+          <w:left w:val="single" w:color="auto" w:sz="4"/>
+          <w:bottom w:val="single" w:color="auto" w:sz="4"/>
+          <w:right w:val="single" w:color="auto" w:sz="4"/>
+          <w:insideH w:val="single" w:color="auto" w:sz="4"/>
+          <w:insideV w:val="single" w:color="auto" w:sz="4"/>
+        </w:tblBorders>
+      </w:tblPr>
+      <w:tblGrid>
+        <w:gridCol w:w="2000"/>
+        <w:gridCol w:w="7026"/>
+      </w:tblGrid>
+      <w:tr>
+        <w:tc>
+          <w:tcPr>
+            <w:tcW w:type="dxa" w:w="2000"/>
+            <w:tcBorders>
+              <w:top w:val="none" w:color="FFFFFF" w:sz="0"/>
+              <w:left w:val="none" w:color="FFFFFF" w:sz="0"/>
+              <w:bottom w:val="single" w:color="BFBFBF" w:sz="4"/>
+              <w:right w:val="none" w:color="FFFFFF" w:sz="0"/>
+            </w:tcBorders>
+            <w:shd w:fill="F2F5FA" w:color="auto" w:val="clear"/>
+            <w:tcMar>
+              <w:top w:type="dxa" w:w="110"/>
+              <w:left w:type="dxa" w:w="140"/>
+              <w:bottom w:type="dxa" w:w="110"/>
+              <w:right w:type="dxa" w:w="140"/>
+            </w:tcMar>
+          </w:tcPr>
+          <w:p>
+            <w:r>
+              <w:rPr>
+                <w:b/>
+                <w:bCs/>
+                <w:color w:val="1F3864"/>
+                <w:sz w:val="22"/>
+                <w:szCs w:val="22"/>
+              </w:rPr>
+              <w:t xml:space="preserve">Samedi</w:t>
+            </w:r>
+          </w:p>
+        </w:tc>
+        <w:tc>
+          <w:tcPr>
+            <w:tcW w:type="dxa" w:w="7026"/>
             <w:tcBorders>
               <w:top w:val="none" w:color="FFFFFF" w:sz="0"/>
               <w:left w:val="none" w:color="FFFFFF" w:sz="0"/>

</xml_diff>